<commit_message>
Update research documents and make project pages English only
</commit_message>
<xml_diff>
--- a/assets/Jianxuan_Shao_RP.docx
+++ b/assets/Jianxuan_Shao_RP.docx
@@ -7,7 +7,7 @@
         <w:pStyle w:val="Title"/>
       </w:pPr>
       <w:r>
-        <w:t>User Control of Proactive Assistance in Spatial Workspaces</w:t>
+        <w:t>Personal AI Collaboration in Changing Spaces</w:t>
       </w:r>
     </w:p>
     <w:p>
@@ -15,7 +15,15 @@
         <w:pStyle w:val="Subtitle"/>
       </w:pPr>
       <w:r>
-        <w:t>PhD research proposal   |   Jianxuan Shao   |   23 October 2026</w:t>
+        <w:t>Shared understanding and revisable action in XR</w:t>
+      </w:r>
+    </w:p>
+    <w:p>
+      <w:r>
+        <w:rPr>
+          <w:sz w:val="20"/>
+        </w:rPr>
+        <w:t>Jianxuan Shao | PhD research proposal | 28 October 2026</w:t>
       </w:r>
     </w:p>
     <w:p>
@@ -23,12 +31,22 @@
         <w:pStyle w:val="Heading1"/>
       </w:pPr>
       <w:r>
-        <w:t>Abstract</w:t>
+        <w:t>Research vision and motivating problem</w:t>
       </w:r>
     </w:p>
     <w:p>
       <w:r>
-        <w:t>A useful assistant must recognise when the help a person welcomes has changed. In a spatial workspace, reducing clutter may help a user finish a task, yet moving the same windows can interrupt deliberate exploration or disrupt a familiar arrangement. A refusal may mean “not this layout”, “not during this task”, or a preference that should persist. I propose to study how proactive assistance can distinguish potential task benefit, currently welcome help and the effort a user can spend steering it. Three studies will establish these distinctions in spatial work, compare explicit tracking of current needs and feedback scope with a strong context-aware policy, and examine repair across repeated sessions. The initial system will offer reversible window reconfiguration in VR, with preview, direct choice and immediate recovery. It will use task events and explicit feedback rather than assume that observable behaviour reveals private intentions or emotional state. The intended contribution is evidence about when structured adaptation reduces unwanted help, when it adds unnecessary coordination, and how users can revise the scope of a correction.</w:t>
+        <w:t>I want to develop personal AI assistants that people can talk to while doing things: assistants that understand their surroundings, contribute useful actions, retain useful memories and develop a consistent way of interacting across activities. Speech, spatial information and manipulable models could give this collaboration a place in the world. My doctoral starting point is how a person and an assistant establish what they are trying to do together, make that understanding actionable, and revise it as circumstances change.</w:t>
+      </w:r>
+    </w:p>
+    <w:p>
+      <w:r>
+        <w:t>Consider preparing a small exhibition. I point and say, 'Turn these towards the entrance, but keep that work visible.' The assistant must identify the exhibits, interpret the viewing relationship and propose a suitable change. I may correct its target, demonstrate a different angle or change the visitor route after walking through the room. A useful collaborator should carry forward what we have agreed while helping revise what no longer works. This is a problem of continuing joint action as well as recognising an instruction.</w:t>
+      </w:r>
+    </w:p>
+    <w:p>
+      <w:r>
+        <w:t>I propose to investigate a shared action representation: a small, directly editable connection between the assistant's selected objects, the spatial relations the user wants, and its pending actions. The representation would let a person correct a destination, preserve a viewing relationship or replace a next step while continuing the task. The research asks when making these connections explicit improves collaboration, and when it adds unnecessary effort.</w:t>
       </w:r>
     </w:p>
     <w:p>
@@ -36,55 +54,17 @@
         <w:pStyle w:val="Heading1"/>
       </w:pPr>
       <w:r>
-        <w:t>Motivation and research proposition</w:t>
+        <w:t>Research context and opportunity</w:t>
       </w:r>
     </w:p>
     <w:p>
       <w:r>
-        <w:t>My longer-term interest is an assistant that can move between understanding a person’s situation and helping change it. Someone may still need substantial help while having little capacity to explain what they want. Conversely, visible frustration does not establish permission to act. This proposal makes that interest experimentally tractable through one spatial interaction: an assistant offering to reposition or resize windows while a person compares and organises design materials.</w:t>
+        <w:t>GazePointAR grounds contextual references in gaze, pointing and conversation [1]. GesPrompt maps speech and co-speech gestures to spatial function calls [2], while VRCopilot supports layout co-creation using editable wireframes [3]. AgentHands produces interactive, spatially grounded hand gestures [4]. Eye2Eye already combines shared attention, revisable contextual memory and feedback-based repair [5]. These systems motivate investigating how users can shape the connection between an assistant's interpretation and its next action.</w:t>
       </w:r>
     </w:p>
     <w:p>
       <w:r>
-        <w:t>Consider a user arranging reference images and notes around a small architectural model. While exploring alternatives, the user wants materials to remain where they placed them. Later, under a deadline, they welcome a compact comparison layout. A previous rejection should not suppress useful help forever; a previous acceptance should not authorise every later change. I use support inertia as an operational label for continuing formerly welcome help after it has become unsuitable. The converse failure is overgeneralising a temporary refusal and withholding help when it is wanted again.</w:t>
-      </w:r>
-    </w:p>
-    <w:p>
-      <w:r>
-        <w:t>The central proposition is that the system should maintain revisable estimates of what help is welcome and what participation it requires, while treating user permissions as explicit constraints. The main prediction is conditional: explicit tracking should be most useful around changes in goals and constraints, rather than improve every stable episode. Whether it outperforms an equally informed general policy is an empirical question.</w:t>
-      </w:r>
-    </w:p>
-    <w:p>
-      <w:r>
-        <w:br w:type="page"/>
-      </w:r>
-    </w:p>
-    <w:p>
-      <w:pPr>
-        <w:pStyle w:val="Heading1"/>
-      </w:pPr>
-      <w:r>
-        <w:t>Research foundation and scope</w:t>
-      </w:r>
-    </w:p>
-    <w:p>
-      <w:r>
-        <w:t>Mixed-initiative interface research already frames assistance as a choice among acting, asking and waiting under uncertainty and interaction costs [1]. Human-AI interaction guidelines also make correction and cautious adaptation established design requirements [2]. These foundations make the consequences of a correction, and its relevance to later tasks, a focused object for evaluation.</w:t>
-      </w:r>
-    </w:p>
-    <w:p>
-      <w:r>
-        <w:t>Recent AR systems provide particularly strong foundations. Satori combines a belief-desire-intention model, vision and a multimodal language model to infer tasks and provide proactive guidance [3]. Sensible Agent adapts both the assistance offered and its interaction mode to multimodal context [4]. These systems establish that context-aware timing and modality are substantive prior work. This proposal focuses more narrowly on how a correction constrains later assistance when a user’s goal changes, and on the effort needed to recover from an incorrect transfer of that correction. I will examine these mechanisms alongside adaptive interfaces and preference learning, testing whether explicit scope tracking improves on the behaviour achievable with the same evidence in a general policy.</w:t>
-      </w:r>
-    </w:p>
-    <w:p>
-      <w:r>
-        <w:t>Professor Xiang Li’s work makes spatial interaction a motivated setting for this question. Handows studies palm-based window control and user-developed layouts in realistic multitasking [5]. Research on on-body menus investigates creation perspectives, placement preferences and recall [6]. These projects motivate attention to physical effort and learned spatial organisation; they do not establish that automatic rearrangement is always desirable. The bodily-control research agenda treats transitions in control and shared agency as design concerns [7]. My initial system changes virtual content rather than actuating a person’s body, so it will test a bounded form of shared control without claiming to resolve bodily-control risks.</w:t>
-      </w:r>
-    </w:p>
-    <w:p>
-      <w:r>
-        <w:t>The evaluation will distinguish task performance, acceptance of help and perceived control. Li, He and Kristensson’s review of 375 papers shows the importance of selecting measures that match an immersive system’s research purpose [8]. Presence or visual appeal will not substitute for evidence that the assistant helped the user accomplish their task.</w:t>
+        <w:t>I will build on this work to study a user-editable representation of action dependencies: letting people directly revise the relations between current intent and pending executable actions, then retain or update those relations after a goal or scene change. Human collaborative tasks show how linguistic and gestural conventions develop through repeated interaction [6]. This motivates studying which agreements should persist, which need checking, and how a correction can affect the next action without forcing a complete restart.</w:t>
       </w:r>
     </w:p>
     <w:p>
@@ -97,40 +77,46 @@
     </w:p>
     <w:p>
       <w:r>
-        <w:rPr>
-          <w:b/>
-        </w:rPr>
-        <w:t xml:space="preserve">RQ1 </w:t>
-      </w:r>
-      <w:r>
-        <w:t>When do potential task benefit, welcome assistance and willingness to participate diverge during spatial work, and what do users mean when they correct or decline help?</w:t>
+        <w:t>RQ1. What spatial references, goals and action dependencies do people need to establish and repair when collaborating with an AI assistant?</w:t>
       </w:r>
     </w:p>
     <w:p>
       <w:r>
-        <w:rPr>
-          <w:b/>
-        </w:rPr>
-        <w:t xml:space="preserve">RQ2 </w:t>
-      </w:r>
-      <w:r>
-        <w:t>Does explicit tracking of current needs and feedback scope improve assistance around goal changes compared with a strong context-aware policy given the same evidence, and at what coordination cost?</w:t>
+        <w:t>RQ2. How does a persistent, editable shared action representation affect successful collaboration and the effort of correcting misunderstandings?</w:t>
       </w:r>
     </w:p>
     <w:p>
       <w:r>
-        <w:rPr>
-          <w:b/>
-        </w:rPr>
-        <w:t xml:space="preserve">RQ3 </w:t>
+        <w:t>RQ3. When goals or spatial conditions change, how can the pair update affected actions while preserving agreements that remain useful?</w:t>
       </w:r>
+    </w:p>
+    <w:p>
+      <w:pPr>
+        <w:pStyle w:val="Heading1"/>
+        <w:pageBreakBefore/>
+      </w:pPr>
       <w:r>
-        <w:t>How should users inspect and revise corrections that apply to one suggestion, one task or future sessions, and how reliably can an assistant restore useful help after a mistake?</w:t>
+        <w:t>Interaction concept and implementation</w:t>
       </w:r>
     </w:p>
     <w:p>
       <w:r>
-        <w:br w:type="page"/>
+        <w:t>The first testbed will be an immersive exhibition workspace with four to eight movable exhibits, display panels and a known entrance. Participants will arrange, inspect and revise a layout. The task uses viewpoint, occlusion and spatial relationships directly, while providing a bounded setting for developing a more general collaborator. My architectural and CAVE experience supplies a practical starting point; the research concerns coordination mechanisms that could later inform other spatial work.</w:t>
+      </w:r>
+    </w:p>
+    <w:p>
+      <w:r>
+        <w:t>A person will speak, select objects and demonstrate destinations or orientations. The assistant will connect relevant objects to a concise statement of the intended relation and a preview of the next action. For example, a visible viewing path can express 'keep this visible from the entrance'; a ghost orientation shows the proposed rotation. The user can select a different referent, drag the destination or revise the relation through speech. Only relevant parts will appear, with a compact task overview available on demand. Early design work will establish when ordinary conversation is enough.</w:t>
+      </w:r>
+    </w:p>
+    <w:p>
+      <w:r>
+        <w:t>I will build one Unity/OpenXR prototype, beginning with desktop debugging and then using laboratory headset and controller access. Existing speech transcription, tracking and a pretrained language or vision-language model will provide input and interpretation. A known scene graph, object IDs and a finite tool API will support move, rotate, group, explain and compare actions. Structured model output will link referents, desired relations, pending actions and dependencies. A validator will check object identity, supported operations and simple geometric constraints before producing a preview. Confirmed digital actions will execute through the API with undo; physical rearrangement in later studies will be performed by the participant.</w:t>
+      </w:r>
+    </w:p>
+    <w:p>
+      <w:r>
+        <w:t>The action state will distinguish user-confirmed agreements from model assumptions, and record the observation and scene version behind each pending action. Changes will mark affected dependencies for review. The assistant can ask for clarification or propose an update, which the user can inspect and modify. The first system will support speech and controller pointing; free-hand techniques will be selected if formative findings justify their effort. Body-centred interfaces such as Handows [7] and on-body disambiguation [8] provide relevant design precedents.</w:t>
       </w:r>
     </w:p>
     <w:p>
@@ -138,22 +124,12 @@
         <w:pStyle w:val="Heading1"/>
       </w:pPr>
       <w:r>
-        <w:t>Prototype and study design</w:t>
+        <w:t>Study 1 Understanding how spatial collaboration develops</w:t>
       </w:r>
     </w:p>
     <w:p>
       <w:r>
-        <w:t>The core environment will be a seated VR workspace with six to eight image and text windows around a simple architectural model. Participants will compare sources and create a short design rationale using supplied materials. The task supports exploration and completion goals, while window positions, scale, occlusion and interaction events are fully logged. Model content will remain fixed so that candidate layout quality can be checked independently of the assistance policy.</w:t>
-      </w:r>
-    </w:p>
-    <w:p>
-      <w:r>
-        <w:t>A deterministic candidate generator will propose a small set of reversible layout changes based on visibility and reach constraints. The policy will choose among showing a layout preview, asking one focused question or waiting. Applying a preview will require confirmation in the primary experiment; an explicit user command can request it at any time. Undo, a saved layout and an always-available pause control will support recovery. Gesture input will be prototyped as an optional implementation path, with a controller alternative; recognition accuracy will be evaluated separately from the assistant’s decision.</w:t>
-      </w:r>
-    </w:p>
-    <w:p>
-      <w:r>
-        <w:t>The proposed representation separates current goal, acceptable help, participation effort and permission scope. Its evidence will be explicit task instructions, recent interaction events and user-provided feedback, with uncertainty retained when evidence is ambiguous. A declined suggestion will constrain that suggestion by default. Broader effects will require an explicit scope such as this task or future sessions. Users can inspect, change and remove these records. Inferred hesitation, silence or repeated undo will not be treated as a diagnosis or a durable preference.</w:t>
+        <w:t>I will observe approximately 12-16 participants working in pairs on small layout and inspection tasks, including people with and without design training. Replay interviews will examine how they establish referents, explain desired effects, divide actions and repair an earlier interpretation. Analysis will retain ambiguous cases and distinguish target, goal, constraint, sequencing and execution problems. A small Wizard-of-Oz iteration within this formative phase will test candidate representations and corrections before model reliability dominates the interaction. Researcher-controlled behaviour will be disclosed and logged. The study will produce a design space of coordination and repair, representative change events and requirements for the prototype.</w:t>
       </w:r>
     </w:p>
     <w:p>
@@ -161,27 +137,31 @@
         <w:pStyle w:val="Heading1"/>
       </w:pPr>
       <w:r>
-        <w:t>Study 1 Grounding welcome assistance and feedback scope</w:t>
+        <w:t>Study 2 Editing understanding while continuing action</w:t>
       </w:r>
     </w:p>
     <w:p>
       <w:r>
-        <w:t>I will begin with approximately 12 to 18 adults who have varied experience organising visual material. Interviews and a task-based walkthrough will examine moments when participants want help but do not want to explain, when they prefer to continue alone, and when a rejection is temporary. Participants will compare identical candidate interventions under different goals, judging potential usefulness, whether they welcome it now and the steering effort they are willing to spend. Short retrospective interviews will examine why these judgments differ.</w:t>
+        <w:t>A counterbalanced within-participant study will compare a conversational assistant with object highlighting, action previews and dialogue-based corrections to the current task state against the same assistant with the persistent shared action representation. Both will use the same XR platform, input modalities, model, scene information, action API, confirmation and undo. Both will permit corrections to targets, goals and constraints. The comparison estimates the value of the linked representation and correction workflow as a whole.</w:t>
       </w:r>
     </w:p>
     <w:p>
       <w:r>
-        <w:t>A formative prototype will use scripted suggestions or a disclosed Wizard-of-Oz operator, avoiding the need to solve perception before understanding the interaction. It will include help opportunities that participants decline and moments when no suggestion is shown. Analysis will combine thematic coding of reasons and correction scope with event-level ratings and recovery traces. Sampling will continue within the planned range according to diversity of relevant episodes rather than a claim of universal saturation.</w:t>
+        <w:t>Matched tasks will include ordinary successful collaboration and controlled, reversible mistakes in a selected object, an intended relation or an inherited goal. The same error instances will be inserted into structured proposals at matched task opportunities in both conditions; natural model errors will be logged separately. This tests recovery from comparable misunderstandings alongside the natural errors reported for the running model. Approximately 24-30 participants is an initial recruitment range; pilot variability and a prespecified precision target will determine the final sample.</w:t>
+      </w:r>
+    </w:p>
+    <w:p>
+      <w:pPr>
+        <w:pStyle w:val="Heading1"/>
+        <w:pageBreakBefore/>
+      </w:pPr>
+      <w:r>
+        <w:t>Study 2 Evaluation and analysis</w:t>
       </w:r>
     </w:p>
     <w:p>
       <w:r>
-        <w:t>A separate pilot will check whether the goal-change manipulation actually changes acceptable help, whether the proposed scope labels are understood, and whether private preference probes disrupt the task. These findings will define a compact annotation protocol, candidate set and preregistered study plan. They will also determine whether a distinct participation estimate adds useful information beyond the current goal and question cost.</w:t>
-      </w:r>
-    </w:p>
-    <w:p>
-      <w:r>
-        <w:br w:type="page"/>
+        <w:t>The primary outcome will be successful repair before the first confirmed execution of the affected action: the mistaken interpretation is corrected and the proposed action meets the independently specified task requirement. Time to reach that state, clarification turns, unintended changes to agreed parts and final layout constraints will capture practical costs. Free-design tasks will use the participant's stated and revisable goal as the reference, separating aesthetic judgement from geometric criteria. Brief probes of what the assistant is about to do, workload and perceived agency will complement behaviour. Analysis will account for repeated observations within participants and tasks, with effect estimates and uncertainty.</w:t>
       </w:r>
     </w:p>
     <w:p>
@@ -189,42 +169,22 @@
         <w:pStyle w:val="Heading1"/>
       </w:pPr>
       <w:r>
-        <w:t>Study 2 Testing assistance when goals change</w:t>
+        <w:t>Study 3 Updating a joint task across changing situations</w:t>
       </w:r>
     </w:p>
     <w:p>
       <w:r>
-        <w:t>The controlled study will compare two policies. The proposed policy will update an explicit state and a structured record of feedback scope. The comparator will be a strong language-model policy that receives the same goals, events, full feedback wording and available actions, including every explicit scope. Both will use the same candidate generator, model version, interface, confirmation and recovery controls, history budget and development data. Both will enforce explicit permissions; the comparison concerns inferred preferences and the transfer of feedback within those limits. Prompt development will use participant-separated pilot data and comparable tuning effort. The comparison will test the value of the representation rather than give one system privileged information.</w:t>
+        <w:t>I will extend the same prototype to a room-scale arrange-inspect-revise workflow. Changes will include a moved object, a revised visitor route or a shift from arrangement to rehearsal. A first physical transfer can use known objects and markers linked to a digital counterpart; this avoids making general-purpose scene reconstruction a prerequisite. A planning sample of 12-16 participants across two short visits will examine early reuse and continuation. The task and equipment will be finalised after the previous system is stable.</w:t>
       </w:r>
     </w:p>
     <w:p>
       <w:r>
-        <w:t>Participants will be assigned to one policy and complete counterbalanced blocks with matched content. Within each participant, a randomised event will either change the task goal from exploration to completion or provide a neutral update matched for reading and attention. Other blocks will test the reverse transition. Before the event, participants will have an opportunity to accept or decline a suggestion and specify its scope. Later blocks will revisit that intervention under the original or a changed goal. Event sequences will be matched across the two policy conditions. Private reports at a small number of fixed decision points will identify acceptable next actions before the policy responds; these reports will remain hidden from both systems. A pilot comparison with fewer probes will assess measurement effects.</w:t>
+        <w:t>Both conditions will retain the same shared action interface, available observations, interaction history, model and manual editing controls. One will present an ordinary refreshed task summary and proposals; the other will explicitly link changed evidence to affected relations and actions, proposing a local revision while retaining still-valid agreements. Matched change opportunities will test the update protocol, with the first proposal after each registered change serving as the update checkpoint. The model will operate on actual observations and records, without an undisclosed operator correcting its decisions.</w:t>
       </w:r>
     </w:p>
     <w:p>
       <w:r>
-        <w:t>The primary outcome will be whether the first post-event action belongs to the participant’s acceptable set, allowing more than one valid action and a deliberate wait. The primary estimand will be the policy difference after a goal change minus the policy difference after a neutral update. This interaction tests the proposed reason for explicit updating. All randomised blocks will enter the analysis; blocks with an observed change in acceptable help will support a secondary descriptive analysis rather than replace the randomised comparison. Mixed-effects models will account for participant and task variation, and results will report probability differences with uncertainty.</w:t>
-      </w:r>
-    </w:p>
-    <w:p>
-      <w:r>
-        <w:t>Secondary outcomes will include unwanted suggestion frequency, missed welcome help, time and actions needed to restore a desired layout, spatial recall, task quality, physical and mental workload, and perceived ability to direct the system. A blinded rubric will assess the design rationale independently of system acceptance. Coordination effort will count reading, confirmation, clarification, correction and recovery, so a policy cannot appear successful merely by asking for permission repeatedly. Perceived control and trust will be reported as separate constructs.</w:t>
-      </w:r>
-    </w:p>
-    <w:p>
-      <w:r>
-        <w:t>Before recruitment, simulation will determine the sample required for the interaction across plausible acceptance rates, within-person dependence and attrition. The study will be scaled to a realistic recruitment budget, with the target fixed before confirmatory data collection. If the interaction cannot be adequately estimated, overall action fit will become the preregistered primary target and transition specificity will remain exploratory. A smaller direct-choice condition will provide a practical benchmark if resources permit; its status and allocation will be specified in advance.</w:t>
-      </w:r>
-    </w:p>
-    <w:p>
-      <w:r>
-        <w:t>Recognition failures, latency and candidate quality will be logged. A technically invalid suggestion will be distinguished from a valid suggestion that is unwelcome. If the informed comparator performs equally well, the result will bound the value of the explicit representation. If direct choice is more efficient, that will support a simpler interaction design.</w:t>
-      </w:r>
-    </w:p>
-    <w:p>
-      <w:r>
-        <w:br w:type="page"/>
+        <w:t>The main outcome will be incorrect carryover per assessable change opportunity: after the update checkpoint, an action presented as current and executable, or actually executed, still relies on an object, relation or goal invalidated by the recorded change. Actions marked as awaiting clarification will be counted separately. Resumption time, unnecessary replanning of agreed work, task quality and supervision effort will reveal trade-offs. Errors will be separated into missed observations, mistaken interpretation, stale dependencies and failed execution. Offline scenarios and a deployment pilot will first check valid actions, retained agreements and clarification behaviour. These visits examine early reuse; longer-term personalisation remains a further stage of the broader vision.</w:t>
       </w:r>
     </w:p>
     <w:p>
@@ -232,68 +192,28 @@
         <w:pStyle w:val="Heading1"/>
       </w:pPr>
       <w:r>
-        <w:t>Study 3 Repair and reuse across sessions</w:t>
+        <w:t>Contributions preparation and research fit</w:t>
       </w:r>
     </w:p>
     <w:p>
       <w:r>
-        <w:t>A repeated-use study with approximately 18 to 24 adults will examine three sessions over two weeks. Participants will resume a saved workspace, encounter both recurring and changed goals, and review corrections they previously made. This study will test whether the assistant avoids repeating a rejected change while allowing similar help when the original restriction no longer applies. Both policies will provide the same inspection and editing controls. Assignment and tasks will be finalised after Study 2; the study will prioritise failure analysis and feasibility rather than claim a second adequately powered efficacy trial.</w:t>
+        <w:t>The programme aims to contribute an empirical account of spatial coordination and repair, an implemented mechanism connecting editable intent to action, and evidence about updating collaboration as activities change. This directly connects to the Situated Reality Lab's situational spatial intelligence, adaptive interfaces and embodied AI with shared agency [9]. My spatial-design and installation experience can ground realistic tasks; Game Fellows motivates the move from following behaviour to a partner that contributes to joint activity. My image-detection capstone adds experience in reproducible evaluation and analysing failures.</w:t>
       </w:r>
     </w:p>
     <w:p>
       <w:r>
-        <w:t>Trace-based interviews will examine when users select, omit or revise a scope, how they understand a remembered restriction, and when maintaining that record becomes work. Measures will include recurrence of previously corrected mistakes, time to restore welcome assistance, removal of stale preferences and voluntary use of inspection controls. Missing sessions, withdrawal and unresolved endings will be reported. A correction successfully saved in software will not count as successful repair unless later behaviour respects it in the relevant context.</w:t>
+        <w:t>Year 1 will develop Unity/C# skills, complete the formative work and establish an end-to-end prototype. Year 2 will develop and evaluate the shared action mechanism. Year 3 will examine updating and physical transfer, followed by synthesis and necessary follow-up in Year 4. Existing models and tracking components will be reused. My browser explorations provide an initial interaction testbed; building and testing a headset prototype is my next technical step.</w:t>
+      </w:r>
+    </w:p>
+    <w:p>
+      <w:r>
+        <w:t>Ethics approval will precede recruitment. Recording will be consented and limited to the task area; participants can pause sensing, take breaks and withdraw. Model-bound inputs will exclude unrelated personal material, and any external processing will be disclosed. Interaction logs will record model, tracking and human-intervention failures separately.</w:t>
       </w:r>
     </w:p>
     <w:p>
       <w:pPr>
         <w:pStyle w:val="Heading1"/>
-      </w:pPr>
-      <w:r>
-        <w:t>Feasibility and preparation</w:t>
-      </w:r>
-    </w:p>
-    <w:p>
-      <w:r>
-        <w:t>My training combines architecture with an ongoing Master of Computer Science at the University of Sydney. Architectural surveying and reconstruction have developed my attention to spatial relationships and the evidence needed to represent them. My interactive-media internship involved supporting CAVE projection, touch and radar interactions, and VR/AR visualisation. My rule-based co-play prototype and team work on explainable AI-image detection have also motivated a stronger connection between implementation, evaluation and the limits of a result. These are starting points for the project; the proposed XR assistant and user studies remain work to be undertaken.</w:t>
-      </w:r>
-    </w:p>
-    <w:p>
-      <w:r>
-        <w:t>Development will begin with a desktop simulation of the same layout events, then move to a standard headset after interaction logging and recovery are reliable. The confirmatory spatial claims will require the headset study. One environment, one intervention family and existing models keep the initial implementation bounded. Training a general multimodal model, fabricating bodily actuators and building a full conversational companion are outside the core programme. Cultural-heritage materials could later support a replication informed by my spatial background, with separate measures if the research question concerns cultural understanding.</w:t>
-      </w:r>
-    </w:p>
-    <w:p>
-      <w:r>
-        <w:t>The studies will use ordinary adult design tasks with consent-based data collection, configurable retention and deletion. They will record only task-relevant signals and optional self-reported readiness. No facial-emotion recognition or continuous personal-life recording is required. Sessions will include breaks, a seated configuration and a controller option, with discomfort and access constraints reported.</w:t>
-      </w:r>
-    </w:p>
-    <w:p>
-      <w:pPr>
-        <w:pStyle w:val="Heading1"/>
-      </w:pPr>
-      <w:r>
-        <w:t>Trajectory and intended contribution</w:t>
-      </w:r>
-    </w:p>
-    <w:p>
-      <w:r>
-        <w:t>Months 1 to 9 will cover the adjacent literature, technical training, ethics, Study 1 and the pilot. Months 10 to 21 will develop the prototype, freeze the comparison and complete Study 2. Months 22 to 30 will examine repair across sessions. Months 31 to 36 will prioritise synthesis and thesis writing, with extensions dependent on the core findings and programme requirements.</w:t>
-      </w:r>
-    </w:p>
-    <w:p>
-      <w:r>
-        <w:t>The intended outputs are a grounded account of welcome assistance and correction scope, a reproducible comparison of assistance policies around goal changes, and design evidence about repair across sessions. Together, they will clarify how a proactive assistant can remain useful when the user needs help but has limited capacity to steer it, while remaining easy to redirect.</w:t>
-      </w:r>
-    </w:p>
-    <w:p>
-      <w:r>
-        <w:br w:type="page"/>
-      </w:r>
-    </w:p>
-    <w:p>
-      <w:pPr>
-        <w:pStyle w:val="Heading1"/>
+        <w:pageBreakBefore/>
       </w:pPr>
       <w:r>
         <w:t>References</w:t>
@@ -301,168 +221,166 @@
     </w:p>
     <w:p>
       <w:pPr>
-        <w:keepNext/>
-        <w:spacing w:after="60"/>
+        <w:keepLines/>
+        <w:spacing w:after="200"/>
       </w:pPr>
       <w:r>
-        <w:t>[1] Horvitz, E. (1999). Principles of Mixed-Initiative User Interfaces. CHI 1999, 159-166.</w:t>
+        <w:t xml:space="preserve">[1] Jaewook Lee, Jun Wang, Elizabeth Brown, Liam Chu, Sebastian S. Rodriguez, Jon E. Froehlich (2024). GazePointAR: A Context-Aware Multimodal Voice Assistant for Pronoun Disambiguation in Wearable Augmented Reality. Proceedings of the CHI Conference on Human Factors in Computing Systems (CHI 2024). </w:t>
       </w:r>
+      <w:hyperlink r:id="rId10">
+        <w:r>
+          <w:rPr>
+            <w:color w:val="000000"/>
+            <w:u w:val="single"/>
+          </w:rPr>
+          <w:t>https://doi.org/10.1145/3613904.3642230</w:t>
+        </w:r>
+      </w:hyperlink>
     </w:p>
     <w:p>
       <w:pPr>
+        <w:keepLines/>
         <w:spacing w:after="200"/>
       </w:pPr>
       <w:r>
-        <w:rPr>
-          <w:sz w:val="20"/>
-        </w:rPr>
-        <w:t>https://www.microsoft.com/en-us/research/publication/principles-mixed-initiative-user-interfaces/</w:t>
+        <w:t xml:space="preserve">[2] Xiyun Hu, Dizhi Ma, Fengming He, Zhengzhe Zhu, Shao-Kang Hsia, Chenfei Zhu, Ziyi Liu, Karthik Ramani (2025). GesPrompt: Leveraging Co-Speech Gestures to Augment LLM-Based Interaction in Virtual Reality. Proceedings of the 2025 ACM Designing Interactive Systems Conference (DIS 2025). </w:t>
       </w:r>
+      <w:hyperlink r:id="rId11">
+        <w:r>
+          <w:rPr>
+            <w:color w:val="000000"/>
+            <w:u w:val="single"/>
+          </w:rPr>
+          <w:t>https://doi.org/10.1145/3715336.3735769</w:t>
+        </w:r>
+      </w:hyperlink>
     </w:p>
     <w:p>
       <w:pPr>
-        <w:keepNext/>
-        <w:spacing w:after="60"/>
+        <w:keepLines/>
+        <w:spacing w:after="200"/>
       </w:pPr>
       <w:r>
-        <w:t>[2] Amershi, S., et al. (2019). Guidelines for Human-AI Interaction. CHI 2019.</w:t>
+        <w:t xml:space="preserve">[3] Lei Zhang, Jin Pan, Jacob Gettig, Steve Oney, Anhong Guo (2024). VRCopilot: Authoring 3D Layouts with Generative AI Models in VR. The 37th Annual ACM Symposium on User Interface Software and Technology (UIST 2024), Article 96. </w:t>
       </w:r>
+      <w:hyperlink r:id="rId12">
+        <w:r>
+          <w:rPr>
+            <w:color w:val="000000"/>
+            <w:u w:val="single"/>
+          </w:rPr>
+          <w:t>https://doi.org/10.1145/3654777.3676451</w:t>
+        </w:r>
+      </w:hyperlink>
     </w:p>
     <w:p>
       <w:pPr>
+        <w:keepLines/>
         <w:spacing w:after="200"/>
       </w:pPr>
       <w:r>
-        <w:rPr>
-          <w:sz w:val="20"/>
-        </w:rPr>
-        <w:t>https://doi.org/10.1145/3290605.3300233</w:t>
+        <w:t xml:space="preserve">[4] Ziyi Liu, David Li, Zhongyi Zhou, David Kim, Ruofei Du, Xun Qian (2026). AgentHands: Generating Interactive Hand Gestures for Spatially Grounded Agent Conversations in XR. Proceedings of the 2026 CHI Conference on Human Factors in Computing Systems (CHI 2026). </w:t>
       </w:r>
+      <w:hyperlink r:id="rId13">
+        <w:r>
+          <w:rPr>
+            <w:color w:val="000000"/>
+            <w:u w:val="single"/>
+          </w:rPr>
+          <w:t>https://doi.org/10.1145/3772318.3790938</w:t>
+        </w:r>
+      </w:hyperlink>
     </w:p>
     <w:p>
       <w:pPr>
-        <w:keepNext/>
-        <w:spacing w:after="60"/>
+        <w:keepLines/>
+        <w:spacing w:after="200"/>
       </w:pPr>
       <w:r>
-        <w:t>[3] Li, C., Wu, G., Chan, G. Y.-Y., Turakhia, D. G., Castelo, S., Li, D., Welch, L., Silva, C. T., &amp; Qian, J. (2025). Satori: Towards Proactive AR Assistant with Belief-Desire-Intention User Modeling. CHI 2025.</w:t>
+        <w:t xml:space="preserve">[5] Zhuyu Teng, Pei Chen, Yichen Cai, Ruoqing Lu, Zhaoqu Jiang, Jiayang Li, Weitao You, Lingyun Sun (2026). Seeing Eye to Eye: Enabling Cognitive Alignment Through Shared First-Person Perspective in Human-AI Collaboration. Proceedings of the 2026 CHI Conference on Human Factors in Computing Systems (CHI 2026). </w:t>
       </w:r>
+      <w:hyperlink r:id="rId14">
+        <w:r>
+          <w:rPr>
+            <w:color w:val="000000"/>
+            <w:u w:val="single"/>
+          </w:rPr>
+          <w:t>https://doi.org/10.1145/3772318.3791059</w:t>
+        </w:r>
+      </w:hyperlink>
     </w:p>
     <w:p>
       <w:pPr>
+        <w:keepLines/>
         <w:spacing w:after="200"/>
       </w:pPr>
       <w:r>
-        <w:rPr>
-          <w:sz w:val="20"/>
-        </w:rPr>
-        <w:t>https://doi.org/10.1145/3706598.3714188</w:t>
+        <w:t xml:space="preserve">[6] Kiyosu Maeda, William P. McCarthy, Ching-Yi Tsai, Jeffrey Mu, Haoliang Wang, Robert D. Hawkins, Judith E. Fan, Parastoo Abtahi (2026). Gesturing Toward Abstraction: Multimodal Convention Formation in Collaborative Physical Tasks. Proceedings of the 2026 CHI Conference on Human Factors in Computing Systems (CHI 2026). </w:t>
       </w:r>
+      <w:hyperlink r:id="rId15">
+        <w:r>
+          <w:rPr>
+            <w:color w:val="000000"/>
+            <w:u w:val="single"/>
+          </w:rPr>
+          <w:t>https://doi.org/10.1145/3772318.3790618</w:t>
+        </w:r>
+      </w:hyperlink>
     </w:p>
     <w:p>
       <w:pPr>
-        <w:keepNext/>
-        <w:spacing w:after="60"/>
+        <w:keepLines/>
+        <w:spacing w:after="200"/>
       </w:pPr>
       <w:r>
-        <w:t>[4] Lee, G., Xia, M., Numan, N., Qian, X., Li, D., Chen, Y., Kulshrestha, A., Chatterjee, I., Zhang, Y., Manocha, D., Kim, D., &amp; Du, R. (2025). Sensible Agent: A Framework for Unobtrusive Interaction with Proactive AR Agents. UIST 2025.</w:t>
+        <w:t xml:space="preserve">[7] Jindu Wang, Ke Zhou, Haoyu Ren, Per Ola Kristensson, Xiang Li (2025). Handows: A Palm-Based Interactive Multi-Window Management System in Virtual Reality. IEEE Transactions on Visualization and Computer Graphics, 31(11), 9772-9782. </w:t>
       </w:r>
+      <w:hyperlink r:id="rId16">
+        <w:r>
+          <w:rPr>
+            <w:color w:val="000000"/>
+            <w:u w:val="single"/>
+          </w:rPr>
+          <w:t>https://doi.org/10.1109/TVCG.2025.3616843</w:t>
+        </w:r>
+      </w:hyperlink>
     </w:p>
     <w:p>
       <w:pPr>
+        <w:keepLines/>
         <w:spacing w:after="200"/>
       </w:pPr>
       <w:r>
-        <w:rPr>
-          <w:sz w:val="20"/>
-        </w:rPr>
-        <w:t>https://doi.org/10.1145/3746059.3747748</w:t>
+        <w:t xml:space="preserve">[8] Xiang Li, Per Ola Kristensson (2025). Bend It, Aim It, Tap It: Designing an On-Body Disambiguation Mechanism for Curve Selection in Mixed Reality. Proceedings of the 2025 ACM Symposium on Spatial User Interaction (SUI 2025). </w:t>
       </w:r>
+      <w:hyperlink r:id="rId17">
+        <w:r>
+          <w:rPr>
+            <w:color w:val="000000"/>
+            <w:u w:val="single"/>
+          </w:rPr>
+          <w:t>https://doi.org/10.1145/3694907.3765912</w:t>
+        </w:r>
+      </w:hyperlink>
     </w:p>
     <w:p>
-      <w:pPr>
-        <w:keepNext/>
-        <w:spacing w:after="60"/>
-      </w:pPr>
       <w:r>
-        <w:t>[5] Wang, J., Zhou, K., Ren, H., Kristensson, P. O., &amp; Li, X. (2025). Handows: A Palm-Based Interactive Multi-Window Management System in Virtual Reality. IEEE Transactions on Visualization and Computer Graphics, 31(11), 9772-9782.</w:t>
+        <w:t xml:space="preserve">[9] Situated Reality Lab. Research. Accessed 28 October 2026. </w:t>
       </w:r>
-    </w:p>
-    <w:p>
-      <w:pPr>
-        <w:spacing w:after="200"/>
-      </w:pPr>
-      <w:r>
-        <w:rPr>
-          <w:sz w:val="20"/>
-        </w:rPr>
-        <w:t>https://doi.org/10.1109/TVCG.2025.3616843</w:t>
-      </w:r>
-    </w:p>
-    <w:p>
-      <w:pPr>
-        <w:keepNext/>
-        <w:spacing w:after="60"/>
-      </w:pPr>
-      <w:r>
-        <w:t>[6] Li, X., He, W., Jin, S., Gugenheimer, J., Hui, P., Liang, H.-N., &amp; Kristensson, P. O. (2024). Investigating Creation Perspectives and Icon Placement Preferences for On-Body Menus in Virtual Reality. Proceedings of the ACM on Human-Computer Interaction, 8(ISS).</w:t>
-      </w:r>
-    </w:p>
-    <w:p>
-      <w:pPr>
-        <w:spacing w:after="200"/>
-      </w:pPr>
-      <w:r>
-        <w:rPr>
-          <w:sz w:val="20"/>
-        </w:rPr>
-        <w:t>https://doi.org/10.1145/3698136</w:t>
-      </w:r>
-    </w:p>
-    <w:p>
-      <w:pPr>
-        <w:keepNext/>
-        <w:spacing w:after="60"/>
-      </w:pPr>
-      <w:r>
-        <w:t>[7] Mueller, F. F., et al. (2026). Grand Challenges around Designing Computers’ Control Over Our Bodies. CHI 2026.</w:t>
-      </w:r>
-    </w:p>
-    <w:p>
-      <w:pPr>
-        <w:spacing w:after="200"/>
-      </w:pPr>
-      <w:r>
-        <w:rPr>
-          <w:sz w:val="20"/>
-        </w:rPr>
-        <w:t>https://doi.org/10.1145/3772318.3790606</w:t>
-      </w:r>
-    </w:p>
-    <w:p>
-      <w:pPr>
-        <w:keepNext/>
-        <w:spacing w:after="60"/>
-      </w:pPr>
-      <w:r>
-        <w:t>[8] Li, X., He, W., &amp; Kristensson, P. O. (2026). How Do We Evaluate Experiences in Immersive Environments? CHI 2026.</w:t>
-      </w:r>
-    </w:p>
-    <w:p>
-      <w:pPr>
-        <w:spacing w:after="200"/>
-      </w:pPr>
-      <w:r>
-        <w:rPr>
-          <w:sz w:val="20"/>
-        </w:rPr>
-        <w:t>https://doi.org/10.1145/3772318.3790724</w:t>
-      </w:r>
+      <w:hyperlink r:id="rId18">
+        <w:r>
+          <w:rPr>
+            <w:color w:val="000000"/>
+            <w:u w:val="single"/>
+          </w:rPr>
+          <w:t>https://www.situated-reality.org/research.html</w:t>
+        </w:r>
+      </w:hyperlink>
     </w:p>
     <w:sectPr>
       <w:footerReference w:type="default" r:id="rId9"/>
-      <w:pgSz w:w="11952" w:h="16848"/>
-      <w:pgMar w:top="1037" w:right="1152" w:bottom="979" w:left="1152" w:header="720" w:footer="432" w:gutter="0"/>
+      <w:pgSz w:w="12240" w:h="15840"/>
+      <w:pgMar w:top="936" w:right="1080" w:bottom="936" w:left="1080" w:header="360" w:footer="403" w:gutter="0"/>
       <w:cols w:space="720"/>
       <w:docGrid w:linePitch="360"/>
     </w:sectPr>
@@ -477,7 +395,12 @@
       <w:pStyle w:val="Footer"/>
       <w:jc w:val="right"/>
     </w:pPr>
-    <w:r/>
+    <w:r>
+      <w:rPr>
+        <w:sz w:val="17"/>
+      </w:rPr>
+      <w:t xml:space="preserve">Jianxuan Shao | Research proposal | </w:t>
+    </w:r>
     <w:fldSimple w:instr="PAGE"/>
   </w:p>
 </w:ftr>
@@ -848,10 +771,11 @@
     <w:rsid w:val="00FC693F"/>
     <w:pPr>
       <w:widowControl/>
-      <w:spacing w:line="259" w:lineRule="auto" w:after="140"/>
+      <w:spacing w:line="250" w:lineRule="auto" w:after="120"/>
     </w:pPr>
     <w:rPr>
-      <w:rFonts w:ascii="Calibri" w:hAnsi="Calibri" w:eastAsia="Calibri"/>
+      <w:rFonts w:ascii="Times New Roman" w:hAnsi="Times New Roman" w:eastAsia="Times New Roman"/>
+      <w:b w:val="0"/>
       <w:color w:val="000000"/>
       <w:sz w:val="22"/>
     </w:rPr>
@@ -911,15 +835,15 @@
     <w:pPr>
       <w:keepNext/>
       <w:keepLines/>
-      <w:spacing w:before="220" w:after="120"/>
+      <w:spacing w:before="200" w:after="100"/>
       <w:outlineLvl w:val="0"/>
     </w:pPr>
     <w:rPr>
-      <w:rFonts w:asciiTheme="majorHAnsi" w:eastAsiaTheme="majorEastAsia" w:hAnsiTheme="majorHAnsi" w:cstheme="majorBidi" w:ascii="Calibri" w:hAnsi="Calibri" w:eastAsia="Calibri"/>
+      <w:rFonts w:asciiTheme="majorHAnsi" w:eastAsiaTheme="majorEastAsia" w:hAnsiTheme="majorHAnsi" w:cstheme="majorBidi" w:ascii="Times New Roman" w:hAnsi="Times New Roman" w:eastAsia="Times New Roman"/>
       <w:b/>
       <w:bCs/>
       <w:color w:val="000000"/>
-      <w:sz w:val="28"/>
+      <w:sz w:val="24"/>
       <w:szCs w:val="28"/>
     </w:rPr>
   </w:style>
@@ -935,15 +859,15 @@
     <w:pPr>
       <w:keepNext/>
       <w:keepLines/>
-      <w:spacing w:before="220" w:after="120"/>
+      <w:spacing w:before="200" w:after="100"/>
       <w:outlineLvl w:val="1"/>
     </w:pPr>
     <w:rPr>
-      <w:rFonts w:asciiTheme="majorHAnsi" w:eastAsiaTheme="majorEastAsia" w:hAnsiTheme="majorHAnsi" w:cstheme="majorBidi" w:ascii="Calibri" w:hAnsi="Calibri" w:eastAsia="Calibri"/>
+      <w:rFonts w:asciiTheme="majorHAnsi" w:eastAsiaTheme="majorEastAsia" w:hAnsiTheme="majorHAnsi" w:cstheme="majorBidi" w:ascii="Times New Roman" w:hAnsi="Times New Roman" w:eastAsia="Times New Roman"/>
       <w:b/>
       <w:bCs/>
       <w:color w:val="000000"/>
-      <w:sz w:val="23"/>
+      <w:sz w:val="22"/>
       <w:szCs w:val="26"/>
     </w:rPr>
   </w:style>
@@ -1198,16 +1122,16 @@
     <w:rsid w:val="00FC693F"/>
     <w:pPr>
       <w:keepNext/>
-      <w:spacing w:after="120" w:line="240" w:lineRule="auto" w:before="0"/>
+      <w:spacing w:after="100" w:line="240" w:lineRule="auto" w:before="0"/>
       <w:contextualSpacing/>
     </w:pPr>
     <w:rPr>
-      <w:rFonts w:asciiTheme="majorHAnsi" w:eastAsiaTheme="majorEastAsia" w:hAnsiTheme="majorHAnsi" w:cstheme="majorBidi" w:ascii="Calibri" w:hAnsi="Calibri" w:eastAsia="Calibri"/>
-      <w:b/>
+      <w:rFonts w:asciiTheme="majorHAnsi" w:eastAsiaTheme="majorEastAsia" w:hAnsiTheme="majorHAnsi" w:cstheme="majorBidi" w:ascii="Times New Roman" w:hAnsi="Times New Roman" w:eastAsia="Times New Roman"/>
+      <w:b w:val="0"/>
       <w:color w:val="000000"/>
       <w:spacing w:val="5"/>
       <w:kern w:val="28"/>
-      <w:sz w:val="42"/>
+      <w:sz w:val="46"/>
       <w:szCs w:val="52"/>
     </w:rPr>
   </w:style>
@@ -1235,18 +1159,20 @@
     <w:qFormat/>
     <w:rsid w:val="00FC693F"/>
     <w:pPr>
+      <w:keepNext/>
       <w:numPr>
         <w:ilvl w:val="1"/>
       </w:numPr>
-      <w:spacing w:after="240"/>
+      <w:spacing w:before="0" w:after="100"/>
     </w:pPr>
     <w:rPr>
-      <w:rFonts w:asciiTheme="majorHAnsi" w:eastAsiaTheme="majorEastAsia" w:hAnsiTheme="majorHAnsi" w:cstheme="majorBidi" w:ascii="Calibri" w:hAnsi="Calibri" w:eastAsia="Calibri"/>
+      <w:rFonts w:asciiTheme="majorHAnsi" w:eastAsiaTheme="majorEastAsia" w:hAnsiTheme="majorHAnsi" w:cstheme="majorBidi" w:ascii="Times New Roman" w:hAnsi="Times New Roman" w:eastAsia="Times New Roman"/>
+      <w:b w:val="0"/>
       <w:i/>
       <w:iCs/>
       <w:color w:val="000000"/>
       <w:spacing w:val="15"/>
-      <w:sz w:val="20"/>
+      <w:sz w:val="24"/>
       <w:szCs w:val="24"/>
     </w:rPr>
   </w:style>
@@ -1684,6 +1610,9 @@
     <w:qFormat/>
     <w:rsid w:val="00FC693F"/>
     <w:pPr>
+      <w:pBdr>
+        <w:bottom w:val="single" w:sz="4" w:space="4" w:color="4F81BD" w:themeColor="accent1"/>
+      </w:pBdr>
       <w:spacing w:before="200" w:after="280"/>
       <w:ind w:left="936" w:right="936"/>
     </w:pPr>

</xml_diff>